<commit_message>
docs(tower): use Factory port 8769 and correct B06 to 8768
</commit_message>
<xml_diff>
--- a/docs/control-tower-users-manual.docx
+++ b/docs/control-tower-users-manual.docx
@@ -330,7 +330,7 @@
               <w:rPr>
                 <w:sz w:val="20"/>
               </w:rPr>
-              <w:t>Its separately installed Console, currently port 8766</w:t>
+              <w:t>Its separately installed Console, currently port 8768</w:t>
             </w:r>
           </w:p>
         </w:tc>
@@ -495,7 +495,7 @@
               <w:rPr>
                 <w:sz w:val="20"/>
               </w:rPr>
-              <w:t>Factory Console, port set at provisioning (proposed 8768). See section 10</w:t>
+              <w:t>Factory Console, port 8769. See section 10</w:t>
             </w:r>
           </w:p>
         </w:tc>
@@ -2159,7 +2159,7 @@
           <w:rFonts w:ascii="Consolas" w:hAnsi="Consolas"/>
           <w:sz w:val="18"/>
         </w:rPr>
-        <w:t>&amp; $Python -m lightyear_control_tower serve --root $FactoryRoot --authority $FactoryAuthority --port 8768</w:t>
+        <w:t>&amp; $Python -m lightyear_control_tower serve --root $FactoryRoot --authority $FactoryAuthority --port 8769</w:t>
       </w:r>
     </w:p>
     <w:p>

</xml_diff>